<commit_message>
Add dlm models results
</commit_message>
<xml_diff>
--- a/04_Docs/Resultads_AirPollution_PO.docx
+++ b/04_Docs/Resultads_AirPollution_PO.docx
@@ -1694,17 +1694,7 @@
                 <w:szCs w:val="22"/>
                 <w:lang w:val="en-US"/>
               </w:rPr>
-              <w:t xml:space="preserve">VERY </w:t>
-            </w:r>
-            <w:r>
-              <w:rPr>
-                <w:b/>
-                <w:bCs/>
-                <w:sz w:val="22"/>
-                <w:szCs w:val="22"/>
-                <w:lang w:val="en-US"/>
-              </w:rPr>
-              <w:t>PRETERM BIRTH</w:t>
+              <w:t>VERY PRETERM BIRTH</w:t>
             </w:r>
           </w:p>
         </w:tc>
@@ -2842,17 +2832,7 @@
                 <w:szCs w:val="22"/>
                 <w:lang w:val="en-US"/>
               </w:rPr>
-              <w:t xml:space="preserve">MODERATELY </w:t>
-            </w:r>
-            <w:r>
-              <w:rPr>
-                <w:b/>
-                <w:bCs/>
-                <w:sz w:val="22"/>
-                <w:szCs w:val="22"/>
-                <w:lang w:val="en-US"/>
-              </w:rPr>
-              <w:t>PRETERM BIRTH</w:t>
+              <w:t>MODERATELY PRETERM BIRTH</w:t>
             </w:r>
           </w:p>
         </w:tc>
@@ -3982,17 +3962,7 @@
                 <w:szCs w:val="22"/>
                 <w:lang w:val="en-US"/>
               </w:rPr>
-              <w:t xml:space="preserve"> LATE </w:t>
-            </w:r>
-            <w:r>
-              <w:rPr>
-                <w:b/>
-                <w:bCs/>
-                <w:sz w:val="22"/>
-                <w:szCs w:val="22"/>
-                <w:lang w:val="en-US"/>
-              </w:rPr>
-              <w:t>PRETERM BIRTH</w:t>
+              <w:t xml:space="preserve"> LATE PRETERM BIRTH</w:t>
             </w:r>
           </w:p>
         </w:tc>
@@ -35090,6 +35060,7 @@
   <w:style w:type="character" w:default="1" w:styleId="Fuentedeprrafopredeter">
     <w:name w:val="Default Paragraph Font"/>
     <w:uiPriority w:val="1"/>
+    <w:semiHidden/>
     <w:unhideWhenUsed/>
   </w:style>
   <w:style w:type="table" w:default="1" w:styleId="Tablanormal">

</xml_diff>

<commit_message>
Upgrade final document with results
</commit_message>
<xml_diff>
--- a/04_Docs/Resultads_AirPollution_PO.docx
+++ b/04_Docs/Resultads_AirPollution_PO.docx
@@ -36,15 +36,6 @@
         </w:rPr>
         <w:t xml:space="preserve"> (2009-2016)</w:t>
       </w:r>
-    </w:p>
-    <w:p>
-      <w:pPr>
-        <w:rPr>
-          <w:sz w:val="22"/>
-          <w:szCs w:val="22"/>
-          <w:lang w:val="en-US"/>
-        </w:rPr>
-      </w:pPr>
     </w:p>
     <w:p>
       <w:pPr>
@@ -862,14 +853,7 @@
                 <w:sz w:val="22"/>
                 <w:szCs w:val="22"/>
               </w:rPr>
-              <w:t>6.7</w:t>
-            </w:r>
-            <w:r>
-              <w:rPr>
-                <w:sz w:val="22"/>
-                <w:szCs w:val="22"/>
-              </w:rPr>
-              <w:t>%</w:t>
+              <w:t>6.7%</w:t>
             </w:r>
             <w:r>
               <w:rPr>
@@ -936,14 +920,7 @@
                 <w:sz w:val="22"/>
                 <w:szCs w:val="22"/>
               </w:rPr>
-              <w:t>1.8</w:t>
-            </w:r>
-            <w:r>
-              <w:rPr>
-                <w:sz w:val="22"/>
-                <w:szCs w:val="22"/>
-              </w:rPr>
-              <w:t>%</w:t>
+              <w:t>1.8%</w:t>
             </w:r>
             <w:r>
               <w:rPr>
@@ -1010,14 +987,7 @@
                 <w:sz w:val="22"/>
                 <w:szCs w:val="22"/>
               </w:rPr>
-              <w:t>10.1</w:t>
-            </w:r>
-            <w:r>
-              <w:rPr>
-                <w:sz w:val="22"/>
-                <w:szCs w:val="22"/>
-              </w:rPr>
-              <w:t>%</w:t>
+              <w:t>10.1%</w:t>
             </w:r>
             <w:r>
               <w:rPr>
@@ -8069,6 +8039,91 @@
           <w:lang w:val="en-US"/>
         </w:rPr>
       </w:pPr>
+      <w:r>
+        <w:rPr>
+          <w:sz w:val="22"/>
+          <w:szCs w:val="22"/>
+          <w:lang w:val="en-US"/>
+        </w:rPr>
+        <w:br w:type="page"/>
+      </w:r>
+    </w:p>
+    <w:p>
+      <w:pPr>
+        <w:rPr>
+          <w:sz w:val="22"/>
+          <w:szCs w:val="22"/>
+          <w:lang w:val="en-US"/>
+        </w:rPr>
+      </w:pPr>
+      <w:r>
+        <w:rPr>
+          <w:sz w:val="22"/>
+          <w:szCs w:val="22"/>
+          <w:lang w:val="en-US"/>
+        </w:rPr>
+        <w:lastRenderedPageBreak/>
+        <w:t>Figure: Trends perinatal outcomes</w:t>
+      </w:r>
+    </w:p>
+    <w:p>
+      <w:pPr>
+        <w:rPr>
+          <w:sz w:val="22"/>
+          <w:szCs w:val="22"/>
+          <w:lang w:val="en-US"/>
+        </w:rPr>
+      </w:pPr>
+      <w:r>
+        <w:rPr>
+          <w:noProof/>
+          <w:sz w:val="22"/>
+          <w:szCs w:val="22"/>
+          <w:lang w:val="en-US"/>
+          <w14:ligatures w14:val="standardContextual"/>
+        </w:rPr>
+        <w:drawing>
+          <wp:inline distT="0" distB="0" distL="0" distR="0" wp14:anchorId="6D772747" wp14:editId="06222AD5">
+            <wp:extent cx="6480000" cy="6480000"/>
+            <wp:effectExtent l="0" t="0" r="0" b="0"/>
+            <wp:docPr id="1931905747" name="Imagen 1"/>
+            <wp:cNvGraphicFramePr>
+              <a:graphicFrameLocks xmlns:a="http://schemas.openxmlformats.org/drawingml/2006/main" noChangeAspect="1"/>
+            </wp:cNvGraphicFramePr>
+            <a:graphic xmlns:a="http://schemas.openxmlformats.org/drawingml/2006/main">
+              <a:graphicData uri="http://schemas.openxmlformats.org/drawingml/2006/picture">
+                <pic:pic xmlns:pic="http://schemas.openxmlformats.org/drawingml/2006/picture">
+                  <pic:nvPicPr>
+                    <pic:cNvPr id="1931905747" name="Imagen 1931905747"/>
+                    <pic:cNvPicPr/>
+                  </pic:nvPicPr>
+                  <pic:blipFill>
+                    <a:blip r:embed="rId4" cstate="print">
+                      <a:extLst>
+                        <a:ext uri="{28A0092B-C50C-407E-A947-70E740481C1C}">
+                          <a14:useLocalDpi xmlns:a14="http://schemas.microsoft.com/office/drawing/2010/main" val="0"/>
+                        </a:ext>
+                      </a:extLst>
+                    </a:blip>
+                    <a:stretch>
+                      <a:fillRect/>
+                    </a:stretch>
+                  </pic:blipFill>
+                  <pic:spPr>
+                    <a:xfrm>
+                      <a:off x="0" y="0"/>
+                      <a:ext cx="6480000" cy="6480000"/>
+                    </a:xfrm>
+                    <a:prstGeom prst="rect">
+                      <a:avLst/>
+                    </a:prstGeom>
+                  </pic:spPr>
+                </pic:pic>
+              </a:graphicData>
+            </a:graphic>
+          </wp:inline>
+        </w:drawing>
+      </w:r>
       <w:r>
         <w:rPr>
           <w:sz w:val="22"/>
@@ -53548,14 +53603,7 @@
           <w:szCs w:val="22"/>
         </w:rPr>
         <w:lastRenderedPageBreak/>
-        <w:t>PM25 - Central Site</w:t>
-      </w:r>
-      <w:r>
-        <w:rPr>
-          <w:sz w:val="22"/>
-          <w:szCs w:val="22"/>
-        </w:rPr>
-        <w:t xml:space="preserve"> – </w:t>
+        <w:t xml:space="preserve">PM25 - Central Site – </w:t>
       </w:r>
       <w:r>
         <w:rPr>
@@ -53602,7 +53650,7 @@
                     <pic:cNvPicPr/>
                   </pic:nvPicPr>
                   <pic:blipFill>
-                    <a:blip r:embed="rId4" cstate="print">
+                    <a:blip r:embed="rId5" cstate="print">
                       <a:extLst>
                         <a:ext uri="{28A0092B-C50C-407E-A947-70E740481C1C}">
                           <a14:useLocalDpi xmlns:a14="http://schemas.microsoft.com/office/drawing/2010/main" val="0"/>
@@ -53752,7 +53800,7 @@
                     <pic:cNvPicPr/>
                   </pic:nvPicPr>
                   <pic:blipFill>
-                    <a:blip r:embed="rId5" cstate="print">
+                    <a:blip r:embed="rId6" cstate="print">
                       <a:extLst>
                         <a:ext uri="{28A0092B-C50C-407E-A947-70E740481C1C}">
                           <a14:useLocalDpi xmlns:a14="http://schemas.microsoft.com/office/drawing/2010/main" val="0"/>
@@ -53807,14 +53855,7 @@
           <w:szCs w:val="22"/>
         </w:rPr>
         <w:lastRenderedPageBreak/>
-        <w:t>Levo</w:t>
-      </w:r>
-      <w:r>
-        <w:rPr>
-          <w:sz w:val="22"/>
-          <w:szCs w:val="22"/>
-        </w:rPr>
-        <w:t xml:space="preserve"> - Central Site – </w:t>
+        <w:t xml:space="preserve">Levo - Central Site – </w:t>
       </w:r>
       <w:r>
         <w:rPr>
@@ -53861,7 +53902,7 @@
                     <pic:cNvPicPr/>
                   </pic:nvPicPr>
                   <pic:blipFill>
-                    <a:blip r:embed="rId6" cstate="print">
+                    <a:blip r:embed="rId7" cstate="print">
                       <a:extLst>
                         <a:ext uri="{28A0092B-C50C-407E-A947-70E740481C1C}">
                           <a14:useLocalDpi xmlns:a14="http://schemas.microsoft.com/office/drawing/2010/main" val="0"/>
@@ -54004,7 +54045,7 @@
                     <pic:cNvPicPr/>
                   </pic:nvPicPr>
                   <pic:blipFill>
-                    <a:blip r:embed="rId7" cstate="print">
+                    <a:blip r:embed="rId8" cstate="print">
                       <a:extLst>
                         <a:ext uri="{28A0092B-C50C-407E-A947-70E740481C1C}">
                           <a14:useLocalDpi xmlns:a14="http://schemas.microsoft.com/office/drawing/2010/main" val="0"/>
@@ -54052,14 +54093,7 @@
           <w:szCs w:val="22"/>
         </w:rPr>
         <w:lastRenderedPageBreak/>
-        <w:t>K</w:t>
-      </w:r>
-      <w:r>
-        <w:rPr>
-          <w:sz w:val="22"/>
-          <w:szCs w:val="22"/>
-        </w:rPr>
-        <w:t xml:space="preserve"> - Central Site – </w:t>
+        <w:t xml:space="preserve">K - Central Site – </w:t>
       </w:r>
       <w:r>
         <w:rPr>
@@ -54106,7 +54140,7 @@
                     <pic:cNvPicPr/>
                   </pic:nvPicPr>
                   <pic:blipFill>
-                    <a:blip r:embed="rId8" cstate="print">
+                    <a:blip r:embed="rId9" cstate="print">
                       <a:extLst>
                         <a:ext uri="{28A0092B-C50C-407E-A947-70E740481C1C}">
                           <a14:useLocalDpi xmlns:a14="http://schemas.microsoft.com/office/drawing/2010/main" val="0"/>
@@ -54256,7 +54290,7 @@
                     <pic:cNvPicPr/>
                   </pic:nvPicPr>
                   <pic:blipFill>
-                    <a:blip r:embed="rId9" cstate="print">
+                    <a:blip r:embed="rId10" cstate="print">
                       <a:extLst>
                         <a:ext uri="{28A0092B-C50C-407E-A947-70E740481C1C}">
                           <a14:useLocalDpi xmlns:a14="http://schemas.microsoft.com/office/drawing/2010/main" val="0"/>
@@ -54932,6 +54966,7 @@
   <w:style w:type="character" w:default="1" w:styleId="Fuentedeprrafopredeter">
     <w:name w:val="Default Paragraph Font"/>
     <w:uiPriority w:val="1"/>
+    <w:semiHidden/>
     <w:unhideWhenUsed/>
   </w:style>
   <w:style w:type="table" w:default="1" w:styleId="Tablanormal">

</xml_diff>